<commit_message>
I added my reflection report.
</commit_message>
<xml_diff>
--- a/Caleb/Period 3 reflection.docx
+++ b/Caleb/Period 3 reflection.docx
@@ -3,19 +3,155 @@
 <w:document xmlns:wpc="http://schemas.microsoft.com/office/word/2010/wordprocessingCanvas" xmlns:cx="http://schemas.microsoft.com/office/drawing/2014/chartex" xmlns:cx1="http://schemas.microsoft.com/office/drawing/2015/9/8/chartex" xmlns:cx2="http://schemas.microsoft.com/office/drawing/2015/10/21/chartex" xmlns:cx3="http://schemas.microsoft.com/office/drawing/2016/5/9/chartex" xmlns:cx4="http://schemas.microsoft.com/office/drawing/2016/5/10/chartex" xmlns:cx5="http://schemas.microsoft.com/office/drawing/2016/5/11/chartex" xmlns:cx6="http://schemas.microsoft.com/office/drawing/2016/5/12/chartex" xmlns:cx7="http://schemas.microsoft.com/office/drawing/2016/5/13/chartex" xmlns:cx8="http://schemas.microsoft.com/office/drawing/2016/5/14/chartex" xmlns:mc="http://schemas.openxmlformats.org/markup-compatibility/2006" xmlns:aink="http://schemas.microsoft.com/office/drawing/2016/ink" xmlns:am3d="http://schemas.microsoft.com/office/drawing/2017/model3d" xmlns:o="urn:schemas-microsoft-com:office:office" xmlns:oel="http://schemas.microsoft.com/office/2019/extlst" xmlns:r="http://schemas.openxmlformats.org/officeDocument/2006/relationships" xmlns:m="http://schemas.openxmlformats.org/officeDocument/2006/math" xmlns:v="urn:schemas-microsoft-com:vml" xmlns:wp14="http://schemas.microsoft.com/office/word/2010/wordprocessingDrawing" xmlns:wp="http://schemas.openxmlformats.org/drawingml/2006/wordprocessingDrawing" xmlns:w10="urn:schemas-microsoft-com:office:word" xmlns:w="http://schemas.openxmlformats.org/wordprocessingml/2006/main" xmlns:w14="http://schemas.microsoft.com/office/word/2010/wordml" xmlns:w15="http://schemas.microsoft.com/office/word/2012/wordml" xmlns:w16cex="http://schemas.microsoft.com/office/word/2018/wordml/cex" xmlns:w16cid="http://schemas.microsoft.com/office/word/2016/wordml/cid" xmlns:w16="http://schemas.microsoft.com/office/word/2018/wordml" xmlns:w16du="http://schemas.microsoft.com/office/word/2023/wordml/word16du" xmlns:w16sdtdh="http://schemas.microsoft.com/office/word/2020/wordml/sdtdatahash" xmlns:w16sdtfl="http://schemas.microsoft.com/office/word/2024/wordml/sdtformatlock" xmlns:w16se="http://schemas.microsoft.com/office/word/2015/wordml/symex" xmlns:wpg="http://schemas.microsoft.com/office/word/2010/wordprocessingGroup" xmlns:wpi="http://schemas.microsoft.com/office/word/2010/wordprocessingInk" xmlns:wne="http://schemas.microsoft.com/office/word/2006/wordml" xmlns:wps="http://schemas.microsoft.com/office/word/2010/wordprocessingShape" mc:Ignorable="w14 w15 w16se w16cid w16 w16cex w16sdtdh w16sdtfl w16du wp14">
   <w:body>
     <w:p>
+      <w:r>
+        <w:t>Caleb Gaïtou</w:t>
+      </w:r>
+    </w:p>
+    <w:p>
+      <w:r>
+        <w:t>Student Num</w:t>
+      </w:r>
+      <w:r>
+        <w:t>ber</w:t>
+      </w:r>
+      <w:r>
+        <w:t>: 56</w:t>
+      </w:r>
+      <w:r>
+        <w:t>80</w:t>
+      </w:r>
+      <w:r>
+        <w:t>891</w:t>
+      </w:r>
+    </w:p>
+    <w:p>
+      <w:r>
+        <w:t>03/04/2026</w:t>
+      </w:r>
+    </w:p>
+    <w:p>
       <w:pPr>
+        <w:pStyle w:val="Title"/>
         <w:rPr>
           <w:rFonts w:ascii="Times New Roman" w:hAnsi="Times New Roman" w:cs="Times New Roman"/>
         </w:rPr>
       </w:pPr>
-      <w:proofErr w:type="spellStart"/>
       <w:r>
         <w:rPr>
           <w:rFonts w:ascii="Times New Roman" w:hAnsi="Times New Roman" w:cs="Times New Roman"/>
         </w:rPr>
-        <w:t>Refelction</w:t>
-      </w:r>
-      <w:proofErr w:type="spellEnd"/>
+        <w:t xml:space="preserve">Period 3 </w:t>
+      </w:r>
+      <w:r>
+        <w:rPr>
+          <w:rFonts w:ascii="Times New Roman" w:hAnsi="Times New Roman" w:cs="Times New Roman"/>
+        </w:rPr>
+        <w:t>Battle-Bot</w:t>
+      </w:r>
+      <w:r>
+        <w:rPr>
+          <w:rFonts w:ascii="Times New Roman" w:hAnsi="Times New Roman" w:cs="Times New Roman"/>
+        </w:rPr>
+        <w:t xml:space="preserve"> Project Reflection</w:t>
+      </w:r>
+    </w:p>
+    <w:p>
+      <w:pPr>
+        <w:ind w:firstLine="720"/>
+      </w:pPr>
+      <w:r>
+        <w:t xml:space="preserve">This project has been very challenging for </w:t>
+      </w:r>
+      <w:r>
+        <w:t xml:space="preserve">me. I have really struggled understanding how </w:t>
+      </w:r>
+      <w:r>
+        <w:t xml:space="preserve">my bot </w:t>
+      </w:r>
+      <w:r>
+        <w:t>work</w:t>
+      </w:r>
+      <w:r>
+        <w:t xml:space="preserve">s </w:t>
+      </w:r>
+      <w:r>
+        <w:t>and how</w:t>
+      </w:r>
+      <w:r>
+        <w:t xml:space="preserve"> to write good code that will make </w:t>
+      </w:r>
+      <w:r>
+        <w:t>my</w:t>
+      </w:r>
+      <w:r>
+        <w:t xml:space="preserve"> bot </w:t>
+      </w:r>
+      <w:r>
+        <w:t xml:space="preserve">do what I want it to do. Along with this I struggled with the cooperating between my teammate and I, he didn’t really take any initiative which led to me doing all the work. Working on the bot alone was a bit </w:t>
+      </w:r>
+      <w:r>
+        <w:t>overwhelming</w:t>
+      </w:r>
+      <w:r>
+        <w:t xml:space="preserve"> </w:t>
+      </w:r>
+      <w:r>
+        <w:t>at first but in the end,</w:t>
+      </w:r>
+      <w:r>
+        <w:t xml:space="preserve"> </w:t>
+      </w:r>
+      <w:r>
+        <w:t xml:space="preserve">I enjoyed it and it gave me a challenge. I am not usually </w:t>
+      </w:r>
+      <w:r>
+        <w:t xml:space="preserve">one to ask </w:t>
+      </w:r>
+      <w:r>
+        <w:t>questions,</w:t>
+      </w:r>
+      <w:r>
+        <w:t xml:space="preserve"> but this project forced me to do exactly that. </w:t>
+      </w:r>
+      <w:r>
+        <w:t xml:space="preserve">I have learned </w:t>
+      </w:r>
+      <w:r>
+        <w:t xml:space="preserve">how write good code, to diagnose problems that came along with figuring out how to solve </w:t>
+      </w:r>
+      <w:r>
+        <w:t xml:space="preserve">the </w:t>
+      </w:r>
+      <w:r>
+        <w:t>section</w:t>
+      </w:r>
+      <w:r>
+        <w:t xml:space="preserve"> of the race I </w:t>
+      </w:r>
+      <w:r>
+        <w:t xml:space="preserve">have </w:t>
+      </w:r>
+      <w:r>
+        <w:t xml:space="preserve">and </w:t>
+      </w:r>
+      <w:r>
+        <w:t xml:space="preserve">over all I </w:t>
+      </w:r>
+      <w:r>
+        <w:t>learned more about hardware</w:t>
+      </w:r>
+      <w:r>
+        <w:t xml:space="preserve">. </w:t>
+      </w:r>
+      <w:r>
+        <w:t>I really enjoyed this</w:t>
+      </w:r>
+      <w:r>
+        <w:t xml:space="preserve"> period even though it was mostly </w:t>
+      </w:r>
+      <w:r>
+        <w:t xml:space="preserve">full of struggles, I was able to get out of my comfort zone and grow as a person. </w:t>
+      </w:r>
     </w:p>
     <w:sectPr>
       <w:pgSz w:w="12240" w:h="15840"/>

</xml_diff>